<commit_message>
Actualización de PGC: Reportes de Proceso de Control de Cambios
</commit_message>
<xml_diff>
--- a/Documentos/Planes/PGC.docx
+++ b/Documentos/Planes/PGC.docx
@@ -905,7 +905,7 @@
     <w:sdt>
       <w:sdtPr>
         <w:lock w:val="contentLocked"/>
-        <w:id w:val="-1144026075"/>
+        <w:id w:val="61433612"/>
         <w:tag w:val="goog_rdk_0"/>
       </w:sdtPr>
       <w:sdtContent>
@@ -12234,12 +12234,12 @@
           <wp:inline distB="114300" distT="114300" distL="114300" distR="114300">
             <wp:extent cx="4755644" cy="2776222"/>
             <wp:effectExtent b="0" l="0" r="0" t="0"/>
-            <wp:docPr id="2" name="image1.png"/>
+            <wp:docPr id="5" name="image2.png"/>
             <a:graphic>
               <a:graphicData uri="http://schemas.openxmlformats.org/drawingml/2006/picture">
                 <pic:pic>
                   <pic:nvPicPr>
-                    <pic:cNvPr id="0" name="image1.png"/>
+                    <pic:cNvPr id="0" name="image2.png"/>
                     <pic:cNvPicPr preferRelativeResize="0"/>
                   </pic:nvPicPr>
                   <pic:blipFill>
@@ -12615,7 +12615,7 @@
     <w:sdt>
       <w:sdtPr>
         <w:lock w:val="contentLocked"/>
-        <w:id w:val="-1114943465"/>
+        <w:id w:val="-1171730753"/>
         <w:tag w:val="goog_rdk_1"/>
       </w:sdtPr>
       <w:sdtContent>
@@ -12724,7 +12724,7 @@
     <w:sdt>
       <w:sdtPr>
         <w:lock w:val="contentLocked"/>
-        <w:id w:val="1757190365"/>
+        <w:id w:val="43052587"/>
         <w:tag w:val="goog_rdk_2"/>
       </w:sdtPr>
       <w:sdtContent>
@@ -12974,7 +12974,7 @@
     <w:sdt>
       <w:sdtPr>
         <w:lock w:val="contentLocked"/>
-        <w:id w:val="1697315692"/>
+        <w:id w:val="1949597657"/>
         <w:tag w:val="goog_rdk_3"/>
       </w:sdtPr>
       <w:sdtContent>
@@ -13069,7 +13069,7 @@
     <w:sdt>
       <w:sdtPr>
         <w:lock w:val="contentLocked"/>
-        <w:id w:val="667158093"/>
+        <w:id w:val="74904629"/>
         <w:tag w:val="goog_rdk_4"/>
       </w:sdtPr>
       <w:sdtContent>
@@ -13306,7 +13306,7 @@
     <w:sdt>
       <w:sdtPr>
         <w:lock w:val="contentLocked"/>
-        <w:id w:val="697413269"/>
+        <w:id w:val="1834601281"/>
         <w:tag w:val="goog_rdk_5"/>
       </w:sdtPr>
       <w:sdtContent>
@@ -13403,7 +13403,7 @@
     <w:sdt>
       <w:sdtPr>
         <w:lock w:val="contentLocked"/>
-        <w:id w:val="680711839"/>
+        <w:id w:val="-1470282429"/>
         <w:tag w:val="goog_rdk_6"/>
       </w:sdtPr>
       <w:sdtContent>
@@ -13706,7 +13706,7 @@
     <w:sdt>
       <w:sdtPr>
         <w:lock w:val="contentLocked"/>
-        <w:id w:val="719737711"/>
+        <w:id w:val="1826003823"/>
         <w:tag w:val="goog_rdk_7"/>
       </w:sdtPr>
       <w:sdtContent>
@@ -13803,7 +13803,7 @@
     <w:sdt>
       <w:sdtPr>
         <w:lock w:val="contentLocked"/>
-        <w:id w:val="-856518133"/>
+        <w:id w:val="-1346646627"/>
         <w:tag w:val="goog_rdk_8"/>
       </w:sdtPr>
       <w:sdtContent>
@@ -14159,7 +14159,7 @@
     <w:sdt>
       <w:sdtPr>
         <w:lock w:val="contentLocked"/>
-        <w:id w:val="-1528606618"/>
+        <w:id w:val="-1639262682"/>
         <w:tag w:val="goog_rdk_9"/>
       </w:sdtPr>
       <w:sdtContent>
@@ -17653,7 +17653,7 @@
     <w:sdt>
       <w:sdtPr>
         <w:lock w:val="contentLocked"/>
-        <w:id w:val="-1485234217"/>
+        <w:id w:val="-1685183992"/>
         <w:tag w:val="goog_rdk_10"/>
       </w:sdtPr>
       <w:sdtContent>
@@ -22021,7 +22021,7 @@
     <w:sdt>
       <w:sdtPr>
         <w:lock w:val="contentLocked"/>
-        <w:id w:val="-1260657302"/>
+        <w:id w:val="389106197"/>
         <w:tag w:val="goog_rdk_11"/>
       </w:sdtPr>
       <w:sdtContent>
@@ -22642,7 +22642,7 @@
     <w:sdt>
       <w:sdtPr>
         <w:lock w:val="contentLocked"/>
-        <w:id w:val="1991280774"/>
+        <w:id w:val="-1549630235"/>
         <w:tag w:val="goog_rdk_12"/>
       </w:sdtPr>
       <w:sdtContent>
@@ -23263,7 +23263,7 @@
     <w:sdt>
       <w:sdtPr>
         <w:lock w:val="contentLocked"/>
-        <w:id w:val="-198449228"/>
+        <w:id w:val="-1478819123"/>
         <w:tag w:val="goog_rdk_13"/>
       </w:sdtPr>
       <w:sdtContent>
@@ -23889,7 +23889,7 @@
     <w:sdt>
       <w:sdtPr>
         <w:lock w:val="contentLocked"/>
-        <w:id w:val="-1075762753"/>
+        <w:id w:val="914526025"/>
         <w:tag w:val="goog_rdk_14"/>
       </w:sdtPr>
       <w:sdtContent>
@@ -24697,6 +24697,671 @@
           <w:rtl w:val="0"/>
         </w:rPr>
         <w:t xml:space="preserve">Ejemplos de reportes (3)</w:t>
+      </w:r>
+    </w:p>
+    <w:p>
+      <w:pPr>
+        <w:keepNext w:val="0"/>
+        <w:keepLines w:val="0"/>
+        <w:pageBreakBefore w:val="0"/>
+        <w:widowControl w:val="1"/>
+        <w:pBdr>
+          <w:top w:space="0" w:sz="0" w:val="nil"/>
+          <w:left w:space="0" w:sz="0" w:val="nil"/>
+          <w:bottom w:space="0" w:sz="0" w:val="nil"/>
+          <w:right w:space="0" w:sz="0" w:val="nil"/>
+          <w:between w:space="0" w:sz="0" w:val="nil"/>
+        </w:pBdr>
+        <w:shd w:fill="auto" w:val="clear"/>
+        <w:spacing w:after="200" w:before="200" w:line="360" w:lineRule="auto"/>
+        <w:ind w:left="1800" w:right="0" w:firstLine="0"/>
+        <w:jc w:val="left"/>
+        <w:rPr>
+          <w:rFonts w:ascii="Times New Roman" w:cs="Times New Roman" w:eastAsia="Times New Roman" w:hAnsi="Times New Roman"/>
+          <w:b w:val="1"/>
+          <w:bCs w:val="1"/>
+          <w:sz w:val="24"/>
+          <w:szCs w:val="24"/>
+        </w:rPr>
+      </w:pPr>
+      <w:r>
+        <w:rPr>
+          <w:rFonts w:ascii="Times New Roman" w:cs="Times New Roman" w:eastAsia="Times New Roman" w:hAnsi="Times New Roman"/>
+          <w:b w:val="1"/>
+          <w:bCs w:val="1"/>
+          <w:sz w:val="24"/>
+          <w:szCs w:val="24"/>
+          <w:rtl w:val="0"/>
+        </w:rPr>
+        <w:t xml:space="preserve">Lista de versiones de un ítem</w:t>
+      </w:r>
+    </w:p>
+    <w:p>
+      <w:pPr>
+        <w:keepNext w:val="0"/>
+        <w:keepLines w:val="0"/>
+        <w:pageBreakBefore w:val="0"/>
+        <w:widowControl w:val="1"/>
+        <w:pBdr>
+          <w:top w:space="0" w:sz="0" w:val="nil"/>
+          <w:left w:space="0" w:sz="0" w:val="nil"/>
+          <w:bottom w:space="0" w:sz="0" w:val="nil"/>
+          <w:right w:space="0" w:sz="0" w:val="nil"/>
+          <w:between w:space="0" w:sz="0" w:val="nil"/>
+        </w:pBdr>
+        <w:shd w:fill="auto" w:val="clear"/>
+        <w:spacing w:after="200" w:before="200" w:line="360" w:lineRule="auto"/>
+        <w:ind w:left="1800" w:right="0" w:firstLine="0"/>
+        <w:jc w:val="left"/>
+        <w:rPr>
+          <w:rFonts w:ascii="Times New Roman" w:cs="Times New Roman" w:eastAsia="Times New Roman" w:hAnsi="Times New Roman"/>
+          <w:sz w:val="24"/>
+          <w:szCs w:val="24"/>
+        </w:rPr>
+      </w:pPr>
+      <w:r>
+        <w:rPr>
+          <w:rFonts w:ascii="Times New Roman" w:cs="Times New Roman" w:eastAsia="Times New Roman" w:hAnsi="Times New Roman"/>
+          <w:sz w:val="24"/>
+          <w:szCs w:val="24"/>
+          <w:rtl w:val="0"/>
+        </w:rPr>
+        <w:t xml:space="preserve">En la figura 2 se observa el reporte de la lista de versiones de un ítem.</w:t>
+      </w:r>
+    </w:p>
+    <w:p>
+      <w:pPr>
+        <w:keepNext w:val="0"/>
+        <w:keepLines w:val="0"/>
+        <w:pageBreakBefore w:val="0"/>
+        <w:widowControl w:val="1"/>
+        <w:pBdr>
+          <w:top w:space="0" w:sz="0" w:val="nil"/>
+          <w:left w:space="0" w:sz="0" w:val="nil"/>
+          <w:bottom w:space="0" w:sz="0" w:val="nil"/>
+          <w:right w:space="0" w:sz="0" w:val="nil"/>
+          <w:between w:space="0" w:sz="0" w:val="nil"/>
+        </w:pBdr>
+        <w:shd w:fill="auto" w:val="clear"/>
+        <w:spacing w:after="200" w:before="200" w:line="360" w:lineRule="auto"/>
+        <w:ind w:left="1800" w:right="0" w:firstLine="0"/>
+        <w:jc w:val="left"/>
+        <w:rPr>
+          <w:rFonts w:ascii="Times New Roman" w:cs="Times New Roman" w:eastAsia="Times New Roman" w:hAnsi="Times New Roman"/>
+          <w:b w:val="1"/>
+          <w:bCs w:val="1"/>
+          <w:sz w:val="24"/>
+          <w:szCs w:val="24"/>
+        </w:rPr>
+      </w:pPr>
+      <w:r>
+        <w:rPr>
+          <w:rFonts w:ascii="Times New Roman" w:cs="Times New Roman" w:eastAsia="Times New Roman" w:hAnsi="Times New Roman"/>
+          <w:b w:val="1"/>
+          <w:bCs w:val="1"/>
+          <w:sz w:val="24"/>
+          <w:szCs w:val="24"/>
+        </w:rPr>
+        <w:drawing>
+          <wp:inline distB="114300" distT="114300" distL="114300" distR="114300">
+            <wp:extent cx="4792027" cy="1309990"/>
+            <wp:effectExtent b="0" l="0" r="0" t="0"/>
+            <wp:docPr id="2" name="image4.png"/>
+            <a:graphic>
+              <a:graphicData uri="http://schemas.openxmlformats.org/drawingml/2006/picture">
+                <pic:pic>
+                  <pic:nvPicPr>
+                    <pic:cNvPr id="0" name="image4.png"/>
+                    <pic:cNvPicPr preferRelativeResize="0"/>
+                  </pic:nvPicPr>
+                  <pic:blipFill>
+                    <a:blip r:embed="rId8"/>
+                    <a:srcRect b="0" l="0" r="0" t="0"/>
+                    <a:stretch>
+                      <a:fillRect/>
+                    </a:stretch>
+                  </pic:blipFill>
+                  <pic:spPr>
+                    <a:xfrm>
+                      <a:off x="0" y="0"/>
+                      <a:ext cx="4792027" cy="1309990"/>
+                    </a:xfrm>
+                    <a:prstGeom prst="rect"/>
+                    <a:ln/>
+                  </pic:spPr>
+                </pic:pic>
+              </a:graphicData>
+            </a:graphic>
+          </wp:inline>
+        </w:drawing>
+      </w:r>
+      <w:r>
+        <w:rPr>
+          <w:rtl w:val="0"/>
+        </w:rPr>
+      </w:r>
+    </w:p>
+    <w:p>
+      <w:pPr>
+        <w:spacing w:after="200" w:before="200" w:line="360" w:lineRule="auto"/>
+        <w:ind w:left="2160" w:firstLine="720"/>
+        <w:jc w:val="center"/>
+        <w:rPr>
+          <w:rFonts w:ascii="Arial" w:cs="Arial" w:eastAsia="Arial" w:hAnsi="Arial"/>
+          <w:b w:val="1"/>
+          <w:bCs w:val="1"/>
+          <w:i w:val="1"/>
+          <w:iCs w:val="1"/>
+          <w:color w:val="3d3d3a"/>
+          <w:sz w:val="20"/>
+          <w:szCs w:val="20"/>
+        </w:rPr>
+      </w:pPr>
+      <w:r>
+        <w:rPr>
+          <w:rFonts w:ascii="Arial" w:cs="Arial" w:eastAsia="Arial" w:hAnsi="Arial"/>
+          <w:b w:val="1"/>
+          <w:bCs w:val="1"/>
+          <w:i w:val="1"/>
+          <w:iCs w:val="1"/>
+          <w:color w:val="3d3d3a"/>
+          <w:sz w:val="20"/>
+          <w:szCs w:val="20"/>
+          <w:rtl w:val="0"/>
+        </w:rPr>
+        <w:t xml:space="preserve">Figura 2: Lista de versiones de un ítem</w:t>
+      </w:r>
+    </w:p>
+    <w:p>
+      <w:pPr>
+        <w:spacing w:after="200" w:before="200" w:line="360" w:lineRule="auto"/>
+        <w:ind w:left="2160" w:firstLine="720"/>
+        <w:jc w:val="center"/>
+        <w:rPr>
+          <w:rFonts w:ascii="Arial" w:cs="Arial" w:eastAsia="Arial" w:hAnsi="Arial"/>
+          <w:b w:val="1"/>
+          <w:bCs w:val="1"/>
+          <w:i w:val="1"/>
+          <w:iCs w:val="1"/>
+          <w:color w:val="3d3d3a"/>
+          <w:sz w:val="20"/>
+          <w:szCs w:val="20"/>
+        </w:rPr>
+      </w:pPr>
+      <w:r>
+        <w:rPr>
+          <w:rtl w:val="0"/>
+        </w:rPr>
+      </w:r>
+    </w:p>
+    <w:p>
+      <w:pPr>
+        <w:spacing w:after="200" w:before="200" w:line="360" w:lineRule="auto"/>
+        <w:ind w:left="2160" w:firstLine="720"/>
+        <w:jc w:val="center"/>
+        <w:rPr>
+          <w:rFonts w:ascii="Arial" w:cs="Arial" w:eastAsia="Arial" w:hAnsi="Arial"/>
+          <w:b w:val="1"/>
+          <w:bCs w:val="1"/>
+          <w:i w:val="1"/>
+          <w:iCs w:val="1"/>
+          <w:color w:val="3d3d3a"/>
+          <w:sz w:val="20"/>
+          <w:szCs w:val="20"/>
+        </w:rPr>
+      </w:pPr>
+      <w:r>
+        <w:rPr>
+          <w:rtl w:val="0"/>
+        </w:rPr>
+      </w:r>
+    </w:p>
+    <w:p>
+      <w:pPr>
+        <w:spacing w:after="200" w:before="200" w:line="360" w:lineRule="auto"/>
+        <w:ind w:left="2160" w:firstLine="720"/>
+        <w:jc w:val="center"/>
+        <w:rPr>
+          <w:rFonts w:ascii="Arial" w:cs="Arial" w:eastAsia="Arial" w:hAnsi="Arial"/>
+          <w:b w:val="1"/>
+          <w:bCs w:val="1"/>
+          <w:i w:val="1"/>
+          <w:iCs w:val="1"/>
+          <w:color w:val="3d3d3a"/>
+          <w:sz w:val="20"/>
+          <w:szCs w:val="20"/>
+        </w:rPr>
+      </w:pPr>
+      <w:r>
+        <w:rPr>
+          <w:rtl w:val="0"/>
+        </w:rPr>
+      </w:r>
+    </w:p>
+    <w:p>
+      <w:pPr>
+        <w:spacing w:after="200" w:before="200" w:line="360" w:lineRule="auto"/>
+        <w:ind w:left="2160" w:firstLine="720"/>
+        <w:jc w:val="center"/>
+        <w:rPr>
+          <w:rFonts w:ascii="Arial" w:cs="Arial" w:eastAsia="Arial" w:hAnsi="Arial"/>
+          <w:b w:val="1"/>
+          <w:bCs w:val="1"/>
+          <w:i w:val="1"/>
+          <w:iCs w:val="1"/>
+          <w:color w:val="3d3d3a"/>
+          <w:sz w:val="20"/>
+          <w:szCs w:val="20"/>
+        </w:rPr>
+      </w:pPr>
+      <w:r>
+        <w:rPr>
+          <w:rtl w:val="0"/>
+        </w:rPr>
+      </w:r>
+    </w:p>
+    <w:p>
+      <w:pPr>
+        <w:spacing w:after="200" w:before="200" w:line="360" w:lineRule="auto"/>
+        <w:ind w:left="2160" w:firstLine="720"/>
+        <w:jc w:val="center"/>
+        <w:rPr>
+          <w:rFonts w:ascii="Arial" w:cs="Arial" w:eastAsia="Arial" w:hAnsi="Arial"/>
+          <w:b w:val="1"/>
+          <w:bCs w:val="1"/>
+          <w:i w:val="1"/>
+          <w:iCs w:val="1"/>
+          <w:color w:val="3d3d3a"/>
+          <w:sz w:val="20"/>
+          <w:szCs w:val="20"/>
+        </w:rPr>
+      </w:pPr>
+      <w:r>
+        <w:rPr>
+          <w:rtl w:val="0"/>
+        </w:rPr>
+      </w:r>
+    </w:p>
+    <w:p>
+      <w:pPr>
+        <w:spacing w:after="200" w:before="200" w:line="360" w:lineRule="auto"/>
+        <w:ind w:left="2160" w:firstLine="720"/>
+        <w:jc w:val="center"/>
+        <w:rPr>
+          <w:rFonts w:ascii="Arial" w:cs="Arial" w:eastAsia="Arial" w:hAnsi="Arial"/>
+          <w:b w:val="1"/>
+          <w:bCs w:val="1"/>
+          <w:i w:val="1"/>
+          <w:iCs w:val="1"/>
+          <w:color w:val="3d3d3a"/>
+          <w:sz w:val="20"/>
+          <w:szCs w:val="20"/>
+        </w:rPr>
+      </w:pPr>
+      <w:r>
+        <w:rPr>
+          <w:rtl w:val="0"/>
+        </w:rPr>
+      </w:r>
+    </w:p>
+    <w:p>
+      <w:pPr>
+        <w:spacing w:after="200" w:before="200" w:line="360" w:lineRule="auto"/>
+        <w:ind w:left="2160" w:firstLine="720"/>
+        <w:jc w:val="center"/>
+        <w:rPr>
+          <w:rFonts w:ascii="Arial" w:cs="Arial" w:eastAsia="Arial" w:hAnsi="Arial"/>
+          <w:b w:val="1"/>
+          <w:bCs w:val="1"/>
+          <w:i w:val="1"/>
+          <w:iCs w:val="1"/>
+          <w:color w:val="3d3d3a"/>
+          <w:sz w:val="20"/>
+          <w:szCs w:val="20"/>
+        </w:rPr>
+      </w:pPr>
+      <w:r>
+        <w:rPr>
+          <w:rtl w:val="0"/>
+        </w:rPr>
+      </w:r>
+    </w:p>
+    <w:p>
+      <w:pPr>
+        <w:keepNext w:val="0"/>
+        <w:keepLines w:val="0"/>
+        <w:pageBreakBefore w:val="0"/>
+        <w:widowControl w:val="1"/>
+        <w:pBdr>
+          <w:top w:space="0" w:sz="0" w:val="nil"/>
+          <w:left w:space="0" w:sz="0" w:val="nil"/>
+          <w:bottom w:space="0" w:sz="0" w:val="nil"/>
+          <w:right w:space="0" w:sz="0" w:val="nil"/>
+          <w:between w:space="0" w:sz="0" w:val="nil"/>
+        </w:pBdr>
+        <w:shd w:fill="auto" w:val="clear"/>
+        <w:spacing w:after="200" w:before="200" w:line="360" w:lineRule="auto"/>
+        <w:ind w:left="1800" w:right="0" w:firstLine="0"/>
+        <w:jc w:val="left"/>
+        <w:rPr>
+          <w:rFonts w:ascii="Times New Roman" w:cs="Times New Roman" w:eastAsia="Times New Roman" w:hAnsi="Times New Roman"/>
+          <w:b w:val="1"/>
+          <w:bCs w:val="1"/>
+          <w:sz w:val="24"/>
+          <w:szCs w:val="24"/>
+        </w:rPr>
+      </w:pPr>
+      <w:r>
+        <w:rPr>
+          <w:rFonts w:ascii="Times New Roman" w:cs="Times New Roman" w:eastAsia="Times New Roman" w:hAnsi="Times New Roman"/>
+          <w:b w:val="1"/>
+          <w:bCs w:val="1"/>
+          <w:sz w:val="24"/>
+          <w:szCs w:val="24"/>
+          <w:rtl w:val="0"/>
+        </w:rPr>
+        <w:t xml:space="preserve">Lista de ítems de la gestión de la configuración</w:t>
+      </w:r>
+    </w:p>
+    <w:p>
+      <w:pPr>
+        <w:spacing w:after="200" w:before="200" w:line="360" w:lineRule="auto"/>
+        <w:ind w:left="1800" w:firstLine="0"/>
+        <w:rPr>
+          <w:rFonts w:ascii="Times New Roman" w:cs="Times New Roman" w:eastAsia="Times New Roman" w:hAnsi="Times New Roman"/>
+          <w:b w:val="1"/>
+          <w:bCs w:val="1"/>
+          <w:sz w:val="24"/>
+          <w:szCs w:val="24"/>
+        </w:rPr>
+      </w:pPr>
+      <w:r>
+        <w:rPr>
+          <w:rFonts w:ascii="Times New Roman" w:cs="Times New Roman" w:eastAsia="Times New Roman" w:hAnsi="Times New Roman"/>
+          <w:sz w:val="24"/>
+          <w:szCs w:val="24"/>
+          <w:rtl w:val="0"/>
+        </w:rPr>
+        <w:t xml:space="preserve">En la figura 3 se observa el reporte de la lista de ítems de la gestión de la configuración.</w:t>
+      </w:r>
+      <w:r>
+        <w:rPr>
+          <w:rtl w:val="0"/>
+        </w:rPr>
+      </w:r>
+    </w:p>
+    <w:p>
+      <w:pPr>
+        <w:keepNext w:val="0"/>
+        <w:keepLines w:val="0"/>
+        <w:pageBreakBefore w:val="0"/>
+        <w:widowControl w:val="1"/>
+        <w:pBdr>
+          <w:top w:space="0" w:sz="0" w:val="nil"/>
+          <w:left w:space="0" w:sz="0" w:val="nil"/>
+          <w:bottom w:space="0" w:sz="0" w:val="nil"/>
+          <w:right w:space="0" w:sz="0" w:val="nil"/>
+          <w:between w:space="0" w:sz="0" w:val="nil"/>
+        </w:pBdr>
+        <w:shd w:fill="auto" w:val="clear"/>
+        <w:spacing w:after="200" w:before="200" w:line="360" w:lineRule="auto"/>
+        <w:ind w:left="1800" w:right="0" w:firstLine="0"/>
+        <w:jc w:val="left"/>
+        <w:rPr>
+          <w:rFonts w:ascii="Times New Roman" w:cs="Times New Roman" w:eastAsia="Times New Roman" w:hAnsi="Times New Roman"/>
+          <w:b w:val="1"/>
+          <w:bCs w:val="1"/>
+          <w:sz w:val="24"/>
+          <w:szCs w:val="24"/>
+        </w:rPr>
+      </w:pPr>
+      <w:r>
+        <w:rPr>
+          <w:rFonts w:ascii="Times New Roman" w:cs="Times New Roman" w:eastAsia="Times New Roman" w:hAnsi="Times New Roman"/>
+          <w:b w:val="1"/>
+          <w:bCs w:val="1"/>
+          <w:sz w:val="24"/>
+          <w:szCs w:val="24"/>
+        </w:rPr>
+        <w:drawing>
+          <wp:inline distB="114300" distT="114300" distL="114300" distR="114300">
+            <wp:extent cx="4792027" cy="1039540"/>
+            <wp:effectExtent b="0" l="0" r="0" t="0"/>
+            <wp:docPr id="4" name="image5.png"/>
+            <a:graphic>
+              <a:graphicData uri="http://schemas.openxmlformats.org/drawingml/2006/picture">
+                <pic:pic>
+                  <pic:nvPicPr>
+                    <pic:cNvPr id="0" name="image5.png"/>
+                    <pic:cNvPicPr preferRelativeResize="0"/>
+                  </pic:nvPicPr>
+                  <pic:blipFill>
+                    <a:blip r:embed="rId9"/>
+                    <a:srcRect b="0" l="0" r="0" t="0"/>
+                    <a:stretch>
+                      <a:fillRect/>
+                    </a:stretch>
+                  </pic:blipFill>
+                  <pic:spPr>
+                    <a:xfrm>
+                      <a:off x="0" y="0"/>
+                      <a:ext cx="4792027" cy="1039540"/>
+                    </a:xfrm>
+                    <a:prstGeom prst="rect"/>
+                    <a:ln/>
+                  </pic:spPr>
+                </pic:pic>
+              </a:graphicData>
+            </a:graphic>
+          </wp:inline>
+        </w:drawing>
+      </w:r>
+      <w:r>
+        <w:rPr>
+          <w:rtl w:val="0"/>
+        </w:rPr>
+      </w:r>
+    </w:p>
+    <w:p>
+      <w:pPr>
+        <w:spacing w:after="200" w:before="200" w:line="360" w:lineRule="auto"/>
+        <w:ind w:left="2160" w:firstLine="720"/>
+        <w:jc w:val="center"/>
+        <w:rPr>
+          <w:rFonts w:ascii="Times New Roman" w:cs="Times New Roman" w:eastAsia="Times New Roman" w:hAnsi="Times New Roman"/>
+          <w:b w:val="1"/>
+          <w:bCs w:val="1"/>
+          <w:sz w:val="24"/>
+          <w:szCs w:val="24"/>
+        </w:rPr>
+      </w:pPr>
+      <w:r>
+        <w:rPr>
+          <w:rFonts w:ascii="Arial" w:cs="Arial" w:eastAsia="Arial" w:hAnsi="Arial"/>
+          <w:b w:val="1"/>
+          <w:bCs w:val="1"/>
+          <w:i w:val="1"/>
+          <w:iCs w:val="1"/>
+          <w:color w:val="3d3d3a"/>
+          <w:sz w:val="20"/>
+          <w:szCs w:val="20"/>
+          <w:rtl w:val="0"/>
+        </w:rPr>
+        <w:t xml:space="preserve">Figura 3: Lista de ítems de la gestión de la configuración</w:t>
+      </w:r>
+      <w:r>
+        <w:rPr>
+          <w:rtl w:val="0"/>
+        </w:rPr>
+      </w:r>
+    </w:p>
+    <w:p>
+      <w:pPr>
+        <w:keepNext w:val="0"/>
+        <w:keepLines w:val="0"/>
+        <w:pageBreakBefore w:val="0"/>
+        <w:widowControl w:val="1"/>
+        <w:pBdr>
+          <w:top w:space="0" w:sz="0" w:val="nil"/>
+          <w:left w:space="0" w:sz="0" w:val="nil"/>
+          <w:bottom w:space="0" w:sz="0" w:val="nil"/>
+          <w:right w:space="0" w:sz="0" w:val="nil"/>
+          <w:between w:space="0" w:sz="0" w:val="nil"/>
+        </w:pBdr>
+        <w:shd w:fill="auto" w:val="clear"/>
+        <w:spacing w:after="200" w:before="200" w:line="360" w:lineRule="auto"/>
+        <w:ind w:left="1800" w:right="0" w:firstLine="0"/>
+        <w:jc w:val="left"/>
+        <w:rPr>
+          <w:rFonts w:ascii="Times New Roman" w:cs="Times New Roman" w:eastAsia="Times New Roman" w:hAnsi="Times New Roman"/>
+          <w:b w:val="1"/>
+          <w:bCs w:val="1"/>
+          <w:sz w:val="24"/>
+          <w:szCs w:val="24"/>
+        </w:rPr>
+      </w:pPr>
+      <w:r>
+        <w:rPr>
+          <w:rFonts w:ascii="Times New Roman" w:cs="Times New Roman" w:eastAsia="Times New Roman" w:hAnsi="Times New Roman"/>
+          <w:b w:val="1"/>
+          <w:bCs w:val="1"/>
+          <w:sz w:val="24"/>
+          <w:szCs w:val="24"/>
+          <w:rtl w:val="0"/>
+        </w:rPr>
+        <w:t xml:space="preserve">Lista de ítems afectados por una solicitud de cambio</w:t>
+      </w:r>
+    </w:p>
+    <w:p>
+      <w:pPr>
+        <w:spacing w:after="200" w:before="200" w:line="360" w:lineRule="auto"/>
+        <w:ind w:left="1800" w:firstLine="0"/>
+        <w:rPr>
+          <w:rFonts w:ascii="Times New Roman" w:cs="Times New Roman" w:eastAsia="Times New Roman" w:hAnsi="Times New Roman"/>
+          <w:b w:val="1"/>
+          <w:bCs w:val="1"/>
+          <w:sz w:val="24"/>
+          <w:szCs w:val="24"/>
+        </w:rPr>
+      </w:pPr>
+      <w:r>
+        <w:rPr>
+          <w:rFonts w:ascii="Times New Roman" w:cs="Times New Roman" w:eastAsia="Times New Roman" w:hAnsi="Times New Roman"/>
+          <w:sz w:val="24"/>
+          <w:szCs w:val="24"/>
+          <w:rtl w:val="0"/>
+        </w:rPr>
+        <w:t xml:space="preserve">En la figura 4 se observa el reporte de la lista de ítems afectados por una solicitud de cambio</w:t>
+      </w:r>
+      <w:r>
+        <w:rPr>
+          <w:rtl w:val="0"/>
+        </w:rPr>
+      </w:r>
+    </w:p>
+    <w:p>
+      <w:pPr>
+        <w:keepNext w:val="0"/>
+        <w:keepLines w:val="0"/>
+        <w:pageBreakBefore w:val="0"/>
+        <w:widowControl w:val="1"/>
+        <w:pBdr>
+          <w:top w:space="0" w:sz="0" w:val="nil"/>
+          <w:left w:space="0" w:sz="0" w:val="nil"/>
+          <w:bottom w:space="0" w:sz="0" w:val="nil"/>
+          <w:right w:space="0" w:sz="0" w:val="nil"/>
+          <w:between w:space="0" w:sz="0" w:val="nil"/>
+        </w:pBdr>
+        <w:shd w:fill="auto" w:val="clear"/>
+        <w:spacing w:after="200" w:before="200" w:line="360" w:lineRule="auto"/>
+        <w:ind w:left="1800" w:right="0" w:firstLine="0"/>
+        <w:jc w:val="left"/>
+        <w:rPr>
+          <w:rFonts w:ascii="Times New Roman" w:cs="Times New Roman" w:eastAsia="Times New Roman" w:hAnsi="Times New Roman"/>
+          <w:b w:val="1"/>
+          <w:bCs w:val="1"/>
+          <w:sz w:val="24"/>
+          <w:szCs w:val="24"/>
+        </w:rPr>
+      </w:pPr>
+      <w:r>
+        <w:rPr>
+          <w:rFonts w:ascii="Times New Roman" w:cs="Times New Roman" w:eastAsia="Times New Roman" w:hAnsi="Times New Roman"/>
+          <w:b w:val="1"/>
+          <w:bCs w:val="1"/>
+          <w:sz w:val="24"/>
+          <w:szCs w:val="24"/>
+        </w:rPr>
+        <w:drawing>
+          <wp:inline distB="114300" distT="114300" distL="114300" distR="114300">
+            <wp:extent cx="4649152" cy="1303731"/>
+            <wp:effectExtent b="0" l="0" r="0" t="0"/>
+            <wp:docPr id="1" name="image3.png"/>
+            <a:graphic>
+              <a:graphicData uri="http://schemas.openxmlformats.org/drawingml/2006/picture">
+                <pic:pic>
+                  <pic:nvPicPr>
+                    <pic:cNvPr id="0" name="image3.png"/>
+                    <pic:cNvPicPr preferRelativeResize="0"/>
+                  </pic:nvPicPr>
+                  <pic:blipFill>
+                    <a:blip r:embed="rId10"/>
+                    <a:srcRect b="0" l="0" r="0" t="0"/>
+                    <a:stretch>
+                      <a:fillRect/>
+                    </a:stretch>
+                  </pic:blipFill>
+                  <pic:spPr>
+                    <a:xfrm>
+                      <a:off x="0" y="0"/>
+                      <a:ext cx="4649152" cy="1303731"/>
+                    </a:xfrm>
+                    <a:prstGeom prst="rect"/>
+                    <a:ln/>
+                  </pic:spPr>
+                </pic:pic>
+              </a:graphicData>
+            </a:graphic>
+          </wp:inline>
+        </w:drawing>
+      </w:r>
+      <w:r>
+        <w:rPr>
+          <w:rtl w:val="0"/>
+        </w:rPr>
+      </w:r>
+    </w:p>
+    <w:p>
+      <w:pPr>
+        <w:spacing w:after="200" w:before="200" w:line="360" w:lineRule="auto"/>
+        <w:ind w:left="2160" w:firstLine="720"/>
+        <w:jc w:val="center"/>
+        <w:rPr>
+          <w:rFonts w:ascii="Times New Roman" w:cs="Times New Roman" w:eastAsia="Times New Roman" w:hAnsi="Times New Roman"/>
+          <w:b w:val="1"/>
+          <w:bCs w:val="1"/>
+          <w:sz w:val="24"/>
+          <w:szCs w:val="24"/>
+        </w:rPr>
+      </w:pPr>
+      <w:r>
+        <w:rPr>
+          <w:rFonts w:ascii="Arial" w:cs="Arial" w:eastAsia="Arial" w:hAnsi="Arial"/>
+          <w:b w:val="1"/>
+          <w:bCs w:val="1"/>
+          <w:i w:val="1"/>
+          <w:iCs w:val="1"/>
+          <w:color w:val="3d3d3a"/>
+          <w:sz w:val="20"/>
+          <w:szCs w:val="20"/>
+          <w:rtl w:val="0"/>
+        </w:rPr>
+        <w:t xml:space="preserve">Figura 4: Lista de ítems afectados por una solicitud de cambio</w:t>
+      </w:r>
+      <w:r>
+        <w:rPr>
+          <w:rtl w:val="0"/>
+        </w:rPr>
       </w:r>
     </w:p>
     <w:p>
@@ -25501,7 +26166,7 @@
             </w:pPr>
             <w:sdt>
               <w:sdtPr>
-                <w:id w:val="-55964502"/>
+                <w:id w:val="-333292645"/>
                 <w:tag w:val="goog_rdk_15"/>
               </w:sdtPr>
               <w:sdtContent>
@@ -25782,7 +26447,7 @@
             </w:pPr>
             <w:sdt>
               <w:sdtPr>
-                <w:id w:val="1447894300"/>
+                <w:id w:val="-1055063641"/>
                 <w:tag w:val="goog_rdk_16"/>
               </w:sdtPr>
               <w:sdtContent>
@@ -26548,16 +27213,16 @@
           <wp:inline distB="0" distT="0" distL="0" distR="0">
             <wp:extent cx="5399730" cy="3289300"/>
             <wp:effectExtent b="0" l="0" r="0" t="0"/>
-            <wp:docPr descr="Diagrama&#10;&#10;Descripción generada automáticamente" id="1" name="image2.png"/>
+            <wp:docPr descr="Diagrama&#10;&#10;Descripción generada automáticamente" id="3" name="image1.png"/>
             <a:graphic>
               <a:graphicData uri="http://schemas.openxmlformats.org/drawingml/2006/picture">
                 <pic:pic>
                   <pic:nvPicPr>
-                    <pic:cNvPr descr="Diagrama&#10;&#10;Descripción generada automáticamente" id="0" name="image2.png"/>
+                    <pic:cNvPr descr="Diagrama&#10;&#10;Descripción generada automáticamente" id="0" name="image1.png"/>
                     <pic:cNvPicPr preferRelativeResize="0"/>
                   </pic:nvPicPr>
                   <pic:blipFill>
-                    <a:blip r:embed="rId8"/>
+                    <a:blip r:embed="rId11"/>
                     <a:srcRect b="0" l="0" r="0" t="0"/>
                     <a:stretch>
                       <a:fillRect/>
@@ -26718,7 +27383,7 @@
         </w:rPr>
         <w:t xml:space="preserve">GitHub Docs: Understanding GitHub.</w:t>
       </w:r>
-      <w:hyperlink r:id="rId9">
+      <w:hyperlink r:id="rId12">
         <w:r>
           <w:rPr>
             <w:rFonts w:ascii="Times New Roman" w:cs="Times New Roman" w:eastAsia="Times New Roman" w:hAnsi="Times New Roman"/>
@@ -26729,7 +27394,7 @@
           <w:t xml:space="preserve"> </w:t>
         </w:r>
       </w:hyperlink>
-      <w:hyperlink r:id="rId10">
+      <w:hyperlink r:id="rId13">
         <w:r>
           <w:rPr>
             <w:rFonts w:ascii="Times New Roman" w:cs="Times New Roman" w:eastAsia="Times New Roman" w:hAnsi="Times New Roman"/>
@@ -26783,7 +27448,7 @@
         </w:rPr>
         <w:t xml:space="preserve">GitLab Documentation: What is GitLab?.</w:t>
       </w:r>
-      <w:hyperlink r:id="rId11">
+      <w:hyperlink r:id="rId14">
         <w:r>
           <w:rPr>
             <w:rFonts w:ascii="Times New Roman" w:cs="Times New Roman" w:eastAsia="Times New Roman" w:hAnsi="Times New Roman"/>
@@ -26794,7 +27459,7 @@
           <w:t xml:space="preserve"> </w:t>
         </w:r>
       </w:hyperlink>
-      <w:hyperlink r:id="rId12">
+      <w:hyperlink r:id="rId15">
         <w:r>
           <w:rPr>
             <w:rFonts w:ascii="Times New Roman" w:cs="Times New Roman" w:eastAsia="Times New Roman" w:hAnsi="Times New Roman"/>
@@ -26848,7 +27513,7 @@
         </w:rPr>
         <w:t xml:space="preserve">Bitbucket Documentation: Get started with Bitbucket.</w:t>
       </w:r>
-      <w:hyperlink r:id="rId13">
+      <w:hyperlink r:id="rId16">
         <w:r>
           <w:rPr>
             <w:rFonts w:ascii="Times New Roman" w:cs="Times New Roman" w:eastAsia="Times New Roman" w:hAnsi="Times New Roman"/>
@@ -26859,7 +27524,7 @@
           <w:t xml:space="preserve"> </w:t>
         </w:r>
       </w:hyperlink>
-      <w:hyperlink r:id="rId14">
+      <w:hyperlink r:id="rId17">
         <w:r>
           <w:rPr>
             <w:rFonts w:ascii="Times New Roman" w:cs="Times New Roman" w:eastAsia="Times New Roman" w:hAnsi="Times New Roman"/>
@@ -26913,7 +27578,7 @@
         </w:rPr>
         <w:t xml:space="preserve">GitKraken Documentation: GitKraken Client.</w:t>
       </w:r>
-      <w:hyperlink r:id="rId15">
+      <w:hyperlink r:id="rId18">
         <w:r>
           <w:rPr>
             <w:rFonts w:ascii="Times New Roman" w:cs="Times New Roman" w:eastAsia="Times New Roman" w:hAnsi="Times New Roman"/>
@@ -26924,7 +27589,7 @@
           <w:t xml:space="preserve"> </w:t>
         </w:r>
       </w:hyperlink>
-      <w:hyperlink r:id="rId16">
+      <w:hyperlink r:id="rId19">
         <w:r>
           <w:rPr>
             <w:rFonts w:ascii="Times New Roman" w:cs="Times New Roman" w:eastAsia="Times New Roman" w:hAnsi="Times New Roman"/>
@@ -26978,7 +27643,7 @@
         </w:rPr>
         <w:t xml:space="preserve">Mercurial SCM: A free, distributed source control management tool.</w:t>
       </w:r>
-      <w:hyperlink r:id="rId17">
+      <w:hyperlink r:id="rId20">
         <w:r>
           <w:rPr>
             <w:rFonts w:ascii="Times New Roman" w:cs="Times New Roman" w:eastAsia="Times New Roman" w:hAnsi="Times New Roman"/>
@@ -26989,7 +27654,7 @@
           <w:t xml:space="preserve"> </w:t>
         </w:r>
       </w:hyperlink>
-      <w:hyperlink r:id="rId18">
+      <w:hyperlink r:id="rId21">
         <w:r>
           <w:rPr>
             <w:rFonts w:ascii="Times New Roman" w:cs="Times New Roman" w:eastAsia="Times New Roman" w:hAnsi="Times New Roman"/>

</xml_diff>